<commit_message>
feat: implement standardized SVG icon system and scaffold comprehensive GRC platform modules
</commit_message>
<xml_diff>
--- a/grc_wisdom_api/scripts/verify/_tmp_reports/Annual_plan.docx
+++ b/grc_wisdom_api/scripts/verify/_tmp_reports/Annual_plan.docx
@@ -21,7 +21,7 @@
           <w:sz w:val="22"/>
           <w:szCs w:val="22"/>
         </w:rPr>
-        <w:t xml:space="preserve">Tab test plan 2033 (2033) — Active</w:t>
+        <w:t xml:space="preserve">2026 Internal Audit Plan (2026) — Approved</w:t>
       </w:r>
     </w:p>
     <w:p>
@@ -158,7 +158,7 @@
                 <w:sz w:val="17"/>
                 <w:szCs w:val="17"/>
               </w:rPr>
-              <w:t xml:space="preserve">Tab test plan 2033 (2033) — Active</w:t>
+              <w:t xml:space="preserve">2026 Internal Audit Plan (2026) — Approved</w:t>
             </w:r>
           </w:p>
         </w:tc>
@@ -272,7 +272,7 @@
                 <w:sz w:val="17"/>
                 <w:szCs w:val="17"/>
               </w:rPr>
-              <w:t xml:space="preserve">2026-08-16 17:58 UTC</w:t>
+              <w:t xml:space="preserve">2026-08-17 15:43 UTC</w:t>
             </w:r>
           </w:p>
         </w:tc>
@@ -693,7 +693,7 @@
                 <w:sz w:val="17"/>
                 <w:szCs w:val="17"/>
               </w:rPr>
-              <w:t xml:space="preserve">Payment Operations (tab test)</w:t>
+              <w:t xml:space="preserve">Order to cash</w:t>
             </w:r>
           </w:p>
         </w:tc>
@@ -747,7 +747,7 @@
                 <w:sz w:val="17"/>
                 <w:szCs w:val="17"/>
               </w:rPr>
-              <w:t xml:space="preserve">5</w:t>
+              <w:t xml:space="preserve">3.45</w:t>
             </w:r>
           </w:p>
         </w:tc>
@@ -774,6 +774,251 @@
                 <w:sz w:val="17"/>
                 <w:szCs w:val="17"/>
               </w:rPr>
+              <w:t xml:space="preserve">Medium</w:t>
+            </w:r>
+          </w:p>
+        </w:tc>
+        <w:tc>
+          <w:tcPr>
+            <w:tcW w:type="pct" w:w="7.18232044198895%"/>
+            <w:tcBorders>
+              <w:top w:val="single" w:color="E1E7EF" w:sz="1"/>
+              <w:left w:val="single" w:color="E1E7EF" w:sz="1"/>
+              <w:bottom w:val="single" w:color="E1E7EF" w:sz="1"/>
+              <w:right w:val="single" w:color="E1E7EF" w:sz="1"/>
+            </w:tcBorders>
+            <w:tcMar>
+              <w:top w:type="dxa" w:w="60"/>
+              <w:left w:type="dxa" w:w="90"/>
+              <w:bottom w:type="dxa" w:w="60"/>
+              <w:right w:type="dxa" w:w="90"/>
+            </w:tcMar>
+          </w:tcPr>
+          <w:p>
+            <w:r>
+              <w:rPr>
+                <w:color w:val="0B1524"/>
+                <w:sz w:val="17"/>
+                <w:szCs w:val="17"/>
+              </w:rPr>
+              <w:t xml:space="preserve">100</w:t>
+            </w:r>
+          </w:p>
+        </w:tc>
+        <w:tc>
+          <w:tcPr>
+            <w:tcW w:type="pct" w:w="11.049723756906078%"/>
+            <w:tcBorders>
+              <w:top w:val="single" w:color="E1E7EF" w:sz="1"/>
+              <w:left w:val="single" w:color="E1E7EF" w:sz="1"/>
+              <w:bottom w:val="single" w:color="E1E7EF" w:sz="1"/>
+              <w:right w:val="single" w:color="E1E7EF" w:sz="1"/>
+            </w:tcBorders>
+            <w:tcMar>
+              <w:top w:type="dxa" w:w="60"/>
+              <w:left w:type="dxa" w:w="90"/>
+              <w:bottom w:type="dxa" w:w="60"/>
+              <w:right w:type="dxa" w:w="90"/>
+            </w:tcMar>
+          </w:tcPr>
+          <w:p>
+            <w:r>
+              <w:rPr>
+                <w:color w:val="0B1524"/>
+                <w:sz w:val="17"/>
+                <w:szCs w:val="17"/>
+              </w:rPr>
+              <w:t xml:space="preserve">Mahmoud Abdulaziz</w:t>
+            </w:r>
+          </w:p>
+        </w:tc>
+        <w:tc>
+          <w:tcPr>
+            <w:tcW w:type="pct" w:w="7.734806629834254%"/>
+            <w:tcBorders>
+              <w:top w:val="single" w:color="E1E7EF" w:sz="1"/>
+              <w:left w:val="single" w:color="E1E7EF" w:sz="1"/>
+              <w:bottom w:val="single" w:color="E1E7EF" w:sz="1"/>
+              <w:right w:val="single" w:color="E1E7EF" w:sz="1"/>
+            </w:tcBorders>
+            <w:tcMar>
+              <w:top w:type="dxa" w:w="60"/>
+              <w:left w:type="dxa" w:w="90"/>
+              <w:bottom w:type="dxa" w:w="60"/>
+              <w:right w:type="dxa" w:w="90"/>
+            </w:tcMar>
+          </w:tcPr>
+          <w:p>
+            <w:r>
+              <w:rPr>
+                <w:color w:val="0B1524"/>
+                <w:sz w:val="17"/>
+                <w:szCs w:val="17"/>
+              </w:rPr>
+              <w:t xml:space="preserve">Planned</w:t>
+            </w:r>
+          </w:p>
+        </w:tc>
+        <w:tc>
+          <w:tcPr>
+            <w:tcW w:type="pct" w:w="27.624309392265197%"/>
+            <w:tcBorders>
+              <w:top w:val="single" w:color="E1E7EF" w:sz="1"/>
+              <w:left w:val="single" w:color="E1E7EF" w:sz="1"/>
+              <w:bottom w:val="single" w:color="E1E7EF" w:sz="1"/>
+              <w:right w:val="single" w:color="E1E7EF" w:sz="1"/>
+            </w:tcBorders>
+            <w:tcMar>
+              <w:top w:type="dxa" w:w="60"/>
+              <w:left w:type="dxa" w:w="90"/>
+              <w:bottom w:type="dxa" w:w="60"/>
+              <w:right w:type="dxa" w:w="90"/>
+            </w:tcMar>
+          </w:tcPr>
+          <w:p>
+            <w:r>
+              <w:rPr>
+                <w:color w:val="0B1524"/>
+                <w:sz w:val="17"/>
+                <w:szCs w:val="17"/>
+              </w:rPr>
+              <w:t xml:space="preserve">Risk tier Medium (score 3.45).</w:t>
+            </w:r>
+          </w:p>
+        </w:tc>
+      </w:tr>
+      <w:tr>
+        <w:tc>
+          <w:tcPr>
+            <w:tcW w:type="pct" w:w="4.972375690607735%"/>
+            <w:tcBorders>
+              <w:top w:val="single" w:color="E1E7EF" w:sz="1"/>
+              <w:left w:val="single" w:color="E1E7EF" w:sz="1"/>
+              <w:bottom w:val="single" w:color="E1E7EF" w:sz="1"/>
+              <w:right w:val="single" w:color="E1E7EF" w:sz="1"/>
+            </w:tcBorders>
+            <w:tcMar>
+              <w:top w:type="dxa" w:w="60"/>
+              <w:left w:type="dxa" w:w="90"/>
+              <w:bottom w:type="dxa" w:w="60"/>
+              <w:right w:type="dxa" w:w="90"/>
+            </w:tcMar>
+          </w:tcPr>
+          <w:p>
+            <w:r>
+              <w:rPr>
+                <w:color w:val="0B1524"/>
+                <w:sz w:val="17"/>
+                <w:szCs w:val="17"/>
+              </w:rPr>
+              <w:t xml:space="preserve">Q1</w:t>
+            </w:r>
+          </w:p>
+        </w:tc>
+        <w:tc>
+          <w:tcPr>
+            <w:tcW w:type="pct" w:w="22.099447513812155%"/>
+            <w:tcBorders>
+              <w:top w:val="single" w:color="E1E7EF" w:sz="1"/>
+              <w:left w:val="single" w:color="E1E7EF" w:sz="1"/>
+              <w:bottom w:val="single" w:color="E1E7EF" w:sz="1"/>
+              <w:right w:val="single" w:color="E1E7EF" w:sz="1"/>
+            </w:tcBorders>
+            <w:tcMar>
+              <w:top w:type="dxa" w:w="60"/>
+              <w:left w:type="dxa" w:w="90"/>
+              <w:bottom w:type="dxa" w:w="60"/>
+              <w:right w:type="dxa" w:w="90"/>
+            </w:tcMar>
+          </w:tcPr>
+          <w:p>
+            <w:r>
+              <w:rPr>
+                <w:color w:val="0B1524"/>
+                <w:sz w:val="17"/>
+                <w:szCs w:val="17"/>
+              </w:rPr>
+              <w:t xml:space="preserve">Third-party and cloud management</w:t>
+            </w:r>
+          </w:p>
+        </w:tc>
+        <w:tc>
+          <w:tcPr>
+            <w:tcW w:type="pct" w:w="7.734806629834254%"/>
+            <w:tcBorders>
+              <w:top w:val="single" w:color="E1E7EF" w:sz="1"/>
+              <w:left w:val="single" w:color="E1E7EF" w:sz="1"/>
+              <w:bottom w:val="single" w:color="E1E7EF" w:sz="1"/>
+              <w:right w:val="single" w:color="E1E7EF" w:sz="1"/>
+            </w:tcBorders>
+            <w:tcMar>
+              <w:top w:type="dxa" w:w="60"/>
+              <w:left w:type="dxa" w:w="90"/>
+              <w:bottom w:type="dxa" w:w="60"/>
+              <w:right w:type="dxa" w:w="90"/>
+            </w:tcMar>
+          </w:tcPr>
+          <w:p>
+            <w:r>
+              <w:rPr>
+                <w:color w:val="0B1524"/>
+                <w:sz w:val="17"/>
+                <w:szCs w:val="17"/>
+              </w:rPr>
+              <w:t xml:space="preserve">ThirdParty</w:t>
+            </w:r>
+          </w:p>
+        </w:tc>
+        <w:tc>
+          <w:tcPr>
+            <w:tcW w:type="pct" w:w="6.077348066298343%"/>
+            <w:tcBorders>
+              <w:top w:val="single" w:color="E1E7EF" w:sz="1"/>
+              <w:left w:val="single" w:color="E1E7EF" w:sz="1"/>
+              <w:bottom w:val="single" w:color="E1E7EF" w:sz="1"/>
+              <w:right w:val="single" w:color="E1E7EF" w:sz="1"/>
+            </w:tcBorders>
+            <w:tcMar>
+              <w:top w:type="dxa" w:w="60"/>
+              <w:left w:type="dxa" w:w="90"/>
+              <w:bottom w:type="dxa" w:w="60"/>
+              <w:right w:type="dxa" w:w="90"/>
+            </w:tcMar>
+          </w:tcPr>
+          <w:p>
+            <w:r>
+              <w:rPr>
+                <w:color w:val="0B1524"/>
+                <w:sz w:val="17"/>
+                <w:szCs w:val="17"/>
+              </w:rPr>
+              <w:t xml:space="preserve">4.95</w:t>
+            </w:r>
+          </w:p>
+        </w:tc>
+        <w:tc>
+          <w:tcPr>
+            <w:tcW w:type="pct" w:w="5.524861878453039%"/>
+            <w:tcBorders>
+              <w:top w:val="single" w:color="E1E7EF" w:sz="1"/>
+              <w:left w:val="single" w:color="E1E7EF" w:sz="1"/>
+              <w:bottom w:val="single" w:color="E1E7EF" w:sz="1"/>
+              <w:right w:val="single" w:color="E1E7EF" w:sz="1"/>
+            </w:tcBorders>
+            <w:tcMar>
+              <w:top w:type="dxa" w:w="60"/>
+              <w:left w:type="dxa" w:w="90"/>
+              <w:bottom w:type="dxa" w:w="60"/>
+              <w:right w:type="dxa" w:w="90"/>
+            </w:tcMar>
+          </w:tcPr>
+          <w:p>
+            <w:r>
+              <w:rPr>
+                <w:color w:val="0B1524"/>
+                <w:sz w:val="17"/>
+                <w:szCs w:val="17"/>
+              </w:rPr>
               <w:t xml:space="preserve">High</w:t>
             </w:r>
           </w:p>
@@ -801,7 +1046,7 @@
                 <w:sz w:val="17"/>
                 <w:szCs w:val="17"/>
               </w:rPr>
-              <w:t xml:space="preserve">80</w:t>
+              <w:t xml:space="preserve">160</w:t>
             </w:r>
           </w:p>
         </w:tc>
@@ -828,7 +1073,7 @@
                 <w:sz w:val="17"/>
                 <w:szCs w:val="17"/>
               </w:rPr>
-              <w:t xml:space="preserve"/>
+              <w:t xml:space="preserve">Mahmoud Abdulaziz</w:t>
             </w:r>
           </w:p>
         </w:tc>
@@ -855,7 +1100,7 @@
                 <w:sz w:val="17"/>
                 <w:szCs w:val="17"/>
               </w:rPr>
-              <w:t xml:space="preserve">InProgress</w:t>
+              <w:t xml:space="preserve">Planned</w:t>
             </w:r>
           </w:p>
         </w:tc>
@@ -882,7 +1127,1722 @@
                 <w:sz w:val="17"/>
                 <w:szCs w:val="17"/>
               </w:rPr>
-              <w:t xml:space="preserve">Highest scored entity.</w:t>
+              <w:t xml:space="preserve">Risk tier High (score 4.95). Never audited.</w:t>
+            </w:r>
+          </w:p>
+        </w:tc>
+      </w:tr>
+      <w:tr>
+        <w:tc>
+          <w:tcPr>
+            <w:tcW w:type="pct" w:w="4.972375690607735%"/>
+            <w:tcBorders>
+              <w:top w:val="single" w:color="E1E7EF" w:sz="1"/>
+              <w:left w:val="single" w:color="E1E7EF" w:sz="1"/>
+              <w:bottom w:val="single" w:color="E1E7EF" w:sz="1"/>
+              <w:right w:val="single" w:color="E1E7EF" w:sz="1"/>
+            </w:tcBorders>
+            <w:tcMar>
+              <w:top w:type="dxa" w:w="60"/>
+              <w:left w:type="dxa" w:w="90"/>
+              <w:bottom w:type="dxa" w:w="60"/>
+              <w:right w:type="dxa" w:w="90"/>
+            </w:tcMar>
+          </w:tcPr>
+          <w:p>
+            <w:r>
+              <w:rPr>
+                <w:color w:val="0B1524"/>
+                <w:sz w:val="17"/>
+                <w:szCs w:val="17"/>
+              </w:rPr>
+              <w:t xml:space="preserve">Q1</w:t>
+            </w:r>
+          </w:p>
+        </w:tc>
+        <w:tc>
+          <w:tcPr>
+            <w:tcW w:type="pct" w:w="22.099447513812155%"/>
+            <w:tcBorders>
+              <w:top w:val="single" w:color="E1E7EF" w:sz="1"/>
+              <w:left w:val="single" w:color="E1E7EF" w:sz="1"/>
+              <w:bottom w:val="single" w:color="E1E7EF" w:sz="1"/>
+              <w:right w:val="single" w:color="E1E7EF" w:sz="1"/>
+            </w:tcBorders>
+            <w:tcMar>
+              <w:top w:type="dxa" w:w="60"/>
+              <w:left w:type="dxa" w:w="90"/>
+              <w:bottom w:type="dxa" w:w="60"/>
+              <w:right w:type="dxa" w:w="90"/>
+            </w:tcMar>
+          </w:tcPr>
+          <w:p>
+            <w:r>
+              <w:rPr>
+                <w:color w:val="0B1524"/>
+                <w:sz w:val="17"/>
+                <w:szCs w:val="17"/>
+              </w:rPr>
+              <w:t xml:space="preserve">Procure to pay</w:t>
+            </w:r>
+          </w:p>
+        </w:tc>
+        <w:tc>
+          <w:tcPr>
+            <w:tcW w:type="pct" w:w="7.734806629834254%"/>
+            <w:tcBorders>
+              <w:top w:val="single" w:color="E1E7EF" w:sz="1"/>
+              <w:left w:val="single" w:color="E1E7EF" w:sz="1"/>
+              <w:bottom w:val="single" w:color="E1E7EF" w:sz="1"/>
+              <w:right w:val="single" w:color="E1E7EF" w:sz="1"/>
+            </w:tcBorders>
+            <w:tcMar>
+              <w:top w:type="dxa" w:w="60"/>
+              <w:left w:type="dxa" w:w="90"/>
+              <w:bottom w:type="dxa" w:w="60"/>
+              <w:right w:type="dxa" w:w="90"/>
+            </w:tcMar>
+          </w:tcPr>
+          <w:p>
+            <w:r>
+              <w:rPr>
+                <w:color w:val="0B1524"/>
+                <w:sz w:val="17"/>
+                <w:szCs w:val="17"/>
+              </w:rPr>
+              <w:t xml:space="preserve">Process</w:t>
+            </w:r>
+          </w:p>
+        </w:tc>
+        <w:tc>
+          <w:tcPr>
+            <w:tcW w:type="pct" w:w="6.077348066298343%"/>
+            <w:tcBorders>
+              <w:top w:val="single" w:color="E1E7EF" w:sz="1"/>
+              <w:left w:val="single" w:color="E1E7EF" w:sz="1"/>
+              <w:bottom w:val="single" w:color="E1E7EF" w:sz="1"/>
+              <w:right w:val="single" w:color="E1E7EF" w:sz="1"/>
+            </w:tcBorders>
+            <w:tcMar>
+              <w:top w:type="dxa" w:w="60"/>
+              <w:left w:type="dxa" w:w="90"/>
+              <w:bottom w:type="dxa" w:w="60"/>
+              <w:right w:type="dxa" w:w="90"/>
+            </w:tcMar>
+          </w:tcPr>
+          <w:p>
+            <w:r>
+              <w:rPr>
+                <w:color w:val="0B1524"/>
+                <w:sz w:val="17"/>
+                <w:szCs w:val="17"/>
+              </w:rPr>
+              <w:t xml:space="preserve">3.85</w:t>
+            </w:r>
+          </w:p>
+        </w:tc>
+        <w:tc>
+          <w:tcPr>
+            <w:tcW w:type="pct" w:w="5.524861878453039%"/>
+            <w:tcBorders>
+              <w:top w:val="single" w:color="E1E7EF" w:sz="1"/>
+              <w:left w:val="single" w:color="E1E7EF" w:sz="1"/>
+              <w:bottom w:val="single" w:color="E1E7EF" w:sz="1"/>
+              <w:right w:val="single" w:color="E1E7EF" w:sz="1"/>
+            </w:tcBorders>
+            <w:tcMar>
+              <w:top w:type="dxa" w:w="60"/>
+              <w:left w:type="dxa" w:w="90"/>
+              <w:bottom w:type="dxa" w:w="60"/>
+              <w:right w:type="dxa" w:w="90"/>
+            </w:tcMar>
+          </w:tcPr>
+          <w:p>
+            <w:r>
+              <w:rPr>
+                <w:color w:val="0B1524"/>
+                <w:sz w:val="17"/>
+                <w:szCs w:val="17"/>
+              </w:rPr>
+              <w:t xml:space="preserve">Medium</w:t>
+            </w:r>
+          </w:p>
+        </w:tc>
+        <w:tc>
+          <w:tcPr>
+            <w:tcW w:type="pct" w:w="7.18232044198895%"/>
+            <w:tcBorders>
+              <w:top w:val="single" w:color="E1E7EF" w:sz="1"/>
+              <w:left w:val="single" w:color="E1E7EF" w:sz="1"/>
+              <w:bottom w:val="single" w:color="E1E7EF" w:sz="1"/>
+              <w:right w:val="single" w:color="E1E7EF" w:sz="1"/>
+            </w:tcBorders>
+            <w:tcMar>
+              <w:top w:type="dxa" w:w="60"/>
+              <w:left w:type="dxa" w:w="90"/>
+              <w:bottom w:type="dxa" w:w="60"/>
+              <w:right w:type="dxa" w:w="90"/>
+            </w:tcMar>
+          </w:tcPr>
+          <w:p>
+            <w:r>
+              <w:rPr>
+                <w:color w:val="0B1524"/>
+                <w:sz w:val="17"/>
+                <w:szCs w:val="17"/>
+              </w:rPr>
+              <w:t xml:space="preserve">100</w:t>
+            </w:r>
+          </w:p>
+        </w:tc>
+        <w:tc>
+          <w:tcPr>
+            <w:tcW w:type="pct" w:w="11.049723756906078%"/>
+            <w:tcBorders>
+              <w:top w:val="single" w:color="E1E7EF" w:sz="1"/>
+              <w:left w:val="single" w:color="E1E7EF" w:sz="1"/>
+              <w:bottom w:val="single" w:color="E1E7EF" w:sz="1"/>
+              <w:right w:val="single" w:color="E1E7EF" w:sz="1"/>
+            </w:tcBorders>
+            <w:tcMar>
+              <w:top w:type="dxa" w:w="60"/>
+              <w:left w:type="dxa" w:w="90"/>
+              <w:bottom w:type="dxa" w:w="60"/>
+              <w:right w:type="dxa" w:w="90"/>
+            </w:tcMar>
+          </w:tcPr>
+          <w:p>
+            <w:r>
+              <w:rPr>
+                <w:color w:val="0B1524"/>
+                <w:sz w:val="17"/>
+                <w:szCs w:val="17"/>
+              </w:rPr>
+              <w:t xml:space="preserve">Mahmoud Abdulaziz</w:t>
+            </w:r>
+          </w:p>
+        </w:tc>
+        <w:tc>
+          <w:tcPr>
+            <w:tcW w:type="pct" w:w="7.734806629834254%"/>
+            <w:tcBorders>
+              <w:top w:val="single" w:color="E1E7EF" w:sz="1"/>
+              <w:left w:val="single" w:color="E1E7EF" w:sz="1"/>
+              <w:bottom w:val="single" w:color="E1E7EF" w:sz="1"/>
+              <w:right w:val="single" w:color="E1E7EF" w:sz="1"/>
+            </w:tcBorders>
+            <w:tcMar>
+              <w:top w:type="dxa" w:w="60"/>
+              <w:left w:type="dxa" w:w="90"/>
+              <w:bottom w:type="dxa" w:w="60"/>
+              <w:right w:type="dxa" w:w="90"/>
+            </w:tcMar>
+          </w:tcPr>
+          <w:p>
+            <w:r>
+              <w:rPr>
+                <w:color w:val="0B1524"/>
+                <w:sz w:val="17"/>
+                <w:szCs w:val="17"/>
+              </w:rPr>
+              <w:t xml:space="preserve">Planned</w:t>
+            </w:r>
+          </w:p>
+        </w:tc>
+        <w:tc>
+          <w:tcPr>
+            <w:tcW w:type="pct" w:w="27.624309392265197%"/>
+            <w:tcBorders>
+              <w:top w:val="single" w:color="E1E7EF" w:sz="1"/>
+              <w:left w:val="single" w:color="E1E7EF" w:sz="1"/>
+              <w:bottom w:val="single" w:color="E1E7EF" w:sz="1"/>
+              <w:right w:val="single" w:color="E1E7EF" w:sz="1"/>
+            </w:tcBorders>
+            <w:tcMar>
+              <w:top w:type="dxa" w:w="60"/>
+              <w:left w:type="dxa" w:w="90"/>
+              <w:bottom w:type="dxa" w:w="60"/>
+              <w:right w:type="dxa" w:w="90"/>
+            </w:tcMar>
+          </w:tcPr>
+          <w:p>
+            <w:r>
+              <w:rPr>
+                <w:color w:val="0B1524"/>
+                <w:sz w:val="17"/>
+                <w:szCs w:val="17"/>
+              </w:rPr>
+              <w:t xml:space="preserve">Risk tier Medium (score 3.85).</w:t>
+            </w:r>
+          </w:p>
+        </w:tc>
+      </w:tr>
+      <w:tr>
+        <w:tc>
+          <w:tcPr>
+            <w:tcW w:type="pct" w:w="4.972375690607735%"/>
+            <w:tcBorders>
+              <w:top w:val="single" w:color="E1E7EF" w:sz="1"/>
+              <w:left w:val="single" w:color="E1E7EF" w:sz="1"/>
+              <w:bottom w:val="single" w:color="E1E7EF" w:sz="1"/>
+              <w:right w:val="single" w:color="E1E7EF" w:sz="1"/>
+            </w:tcBorders>
+            <w:tcMar>
+              <w:top w:type="dxa" w:w="60"/>
+              <w:left w:type="dxa" w:w="90"/>
+              <w:bottom w:type="dxa" w:w="60"/>
+              <w:right w:type="dxa" w:w="90"/>
+            </w:tcMar>
+          </w:tcPr>
+          <w:p>
+            <w:r>
+              <w:rPr>
+                <w:color w:val="0B1524"/>
+                <w:sz w:val="17"/>
+                <w:szCs w:val="17"/>
+              </w:rPr>
+              <w:t xml:space="preserve">Q2</w:t>
+            </w:r>
+          </w:p>
+        </w:tc>
+        <w:tc>
+          <w:tcPr>
+            <w:tcW w:type="pct" w:w="22.099447513812155%"/>
+            <w:tcBorders>
+              <w:top w:val="single" w:color="E1E7EF" w:sz="1"/>
+              <w:left w:val="single" w:color="E1E7EF" w:sz="1"/>
+              <w:bottom w:val="single" w:color="E1E7EF" w:sz="1"/>
+              <w:right w:val="single" w:color="E1E7EF" w:sz="1"/>
+            </w:tcBorders>
+            <w:tcMar>
+              <w:top w:type="dxa" w:w="60"/>
+              <w:left w:type="dxa" w:w="90"/>
+              <w:bottom w:type="dxa" w:w="60"/>
+              <w:right w:type="dxa" w:w="90"/>
+            </w:tcMar>
+          </w:tcPr>
+          <w:p>
+            <w:r>
+              <w:rPr>
+                <w:color w:val="0B1524"/>
+                <w:sz w:val="17"/>
+                <w:szCs w:val="17"/>
+              </w:rPr>
+              <w:t xml:space="preserve">Personal data processing</w:t>
+            </w:r>
+          </w:p>
+        </w:tc>
+        <w:tc>
+          <w:tcPr>
+            <w:tcW w:type="pct" w:w="7.734806629834254%"/>
+            <w:tcBorders>
+              <w:top w:val="single" w:color="E1E7EF" w:sz="1"/>
+              <w:left w:val="single" w:color="E1E7EF" w:sz="1"/>
+              <w:bottom w:val="single" w:color="E1E7EF" w:sz="1"/>
+              <w:right w:val="single" w:color="E1E7EF" w:sz="1"/>
+            </w:tcBorders>
+            <w:tcMar>
+              <w:top w:type="dxa" w:w="60"/>
+              <w:left w:type="dxa" w:w="90"/>
+              <w:bottom w:type="dxa" w:w="60"/>
+              <w:right w:type="dxa" w:w="90"/>
+            </w:tcMar>
+          </w:tcPr>
+          <w:p>
+            <w:r>
+              <w:rPr>
+                <w:color w:val="0B1524"/>
+                <w:sz w:val="17"/>
+                <w:szCs w:val="17"/>
+              </w:rPr>
+              <w:t xml:space="preserve">Process</w:t>
+            </w:r>
+          </w:p>
+        </w:tc>
+        <w:tc>
+          <w:tcPr>
+            <w:tcW w:type="pct" w:w="6.077348066298343%"/>
+            <w:tcBorders>
+              <w:top w:val="single" w:color="E1E7EF" w:sz="1"/>
+              <w:left w:val="single" w:color="E1E7EF" w:sz="1"/>
+              <w:bottom w:val="single" w:color="E1E7EF" w:sz="1"/>
+              <w:right w:val="single" w:color="E1E7EF" w:sz="1"/>
+            </w:tcBorders>
+            <w:tcMar>
+              <w:top w:type="dxa" w:w="60"/>
+              <w:left w:type="dxa" w:w="90"/>
+              <w:bottom w:type="dxa" w:w="60"/>
+              <w:right w:type="dxa" w:w="90"/>
+            </w:tcMar>
+          </w:tcPr>
+          <w:p>
+            <w:r>
+              <w:rPr>
+                <w:color w:val="0B1524"/>
+                <w:sz w:val="17"/>
+                <w:szCs w:val="17"/>
+              </w:rPr>
+              <w:t xml:space="preserve">4.5</w:t>
+            </w:r>
+          </w:p>
+        </w:tc>
+        <w:tc>
+          <w:tcPr>
+            <w:tcW w:type="pct" w:w="5.524861878453039%"/>
+            <w:tcBorders>
+              <w:top w:val="single" w:color="E1E7EF" w:sz="1"/>
+              <w:left w:val="single" w:color="E1E7EF" w:sz="1"/>
+              <w:bottom w:val="single" w:color="E1E7EF" w:sz="1"/>
+              <w:right w:val="single" w:color="E1E7EF" w:sz="1"/>
+            </w:tcBorders>
+            <w:tcMar>
+              <w:top w:type="dxa" w:w="60"/>
+              <w:left w:type="dxa" w:w="90"/>
+              <w:bottom w:type="dxa" w:w="60"/>
+              <w:right w:type="dxa" w:w="90"/>
+            </w:tcMar>
+          </w:tcPr>
+          <w:p>
+            <w:r>
+              <w:rPr>
+                <w:color w:val="0B1524"/>
+                <w:sz w:val="17"/>
+                <w:szCs w:val="17"/>
+              </w:rPr>
+              <w:t xml:space="preserve">High</w:t>
+            </w:r>
+          </w:p>
+        </w:tc>
+        <w:tc>
+          <w:tcPr>
+            <w:tcW w:type="pct" w:w="7.18232044198895%"/>
+            <w:tcBorders>
+              <w:top w:val="single" w:color="E1E7EF" w:sz="1"/>
+              <w:left w:val="single" w:color="E1E7EF" w:sz="1"/>
+              <w:bottom w:val="single" w:color="E1E7EF" w:sz="1"/>
+              <w:right w:val="single" w:color="E1E7EF" w:sz="1"/>
+            </w:tcBorders>
+            <w:tcMar>
+              <w:top w:type="dxa" w:w="60"/>
+              <w:left w:type="dxa" w:w="90"/>
+              <w:bottom w:type="dxa" w:w="60"/>
+              <w:right w:type="dxa" w:w="90"/>
+            </w:tcMar>
+          </w:tcPr>
+          <w:p>
+            <w:r>
+              <w:rPr>
+                <w:color w:val="0B1524"/>
+                <w:sz w:val="17"/>
+                <w:szCs w:val="17"/>
+              </w:rPr>
+              <w:t xml:space="preserve">160</w:t>
+            </w:r>
+          </w:p>
+        </w:tc>
+        <w:tc>
+          <w:tcPr>
+            <w:tcW w:type="pct" w:w="11.049723756906078%"/>
+            <w:tcBorders>
+              <w:top w:val="single" w:color="E1E7EF" w:sz="1"/>
+              <w:left w:val="single" w:color="E1E7EF" w:sz="1"/>
+              <w:bottom w:val="single" w:color="E1E7EF" w:sz="1"/>
+              <w:right w:val="single" w:color="E1E7EF" w:sz="1"/>
+            </w:tcBorders>
+            <w:tcMar>
+              <w:top w:type="dxa" w:w="60"/>
+              <w:left w:type="dxa" w:w="90"/>
+              <w:bottom w:type="dxa" w:w="60"/>
+              <w:right w:type="dxa" w:w="90"/>
+            </w:tcMar>
+          </w:tcPr>
+          <w:p>
+            <w:r>
+              <w:rPr>
+                <w:color w:val="0B1524"/>
+                <w:sz w:val="17"/>
+                <w:szCs w:val="17"/>
+              </w:rPr>
+              <w:t xml:space="preserve">Mahmoud Abdulaziz</w:t>
+            </w:r>
+          </w:p>
+        </w:tc>
+        <w:tc>
+          <w:tcPr>
+            <w:tcW w:type="pct" w:w="7.734806629834254%"/>
+            <w:tcBorders>
+              <w:top w:val="single" w:color="E1E7EF" w:sz="1"/>
+              <w:left w:val="single" w:color="E1E7EF" w:sz="1"/>
+              <w:bottom w:val="single" w:color="E1E7EF" w:sz="1"/>
+              <w:right w:val="single" w:color="E1E7EF" w:sz="1"/>
+            </w:tcBorders>
+            <w:tcMar>
+              <w:top w:type="dxa" w:w="60"/>
+              <w:left w:type="dxa" w:w="90"/>
+              <w:bottom w:type="dxa" w:w="60"/>
+              <w:right w:type="dxa" w:w="90"/>
+            </w:tcMar>
+          </w:tcPr>
+          <w:p>
+            <w:r>
+              <w:rPr>
+                <w:color w:val="0B1524"/>
+                <w:sz w:val="17"/>
+                <w:szCs w:val="17"/>
+              </w:rPr>
+              <w:t xml:space="preserve">Planned</w:t>
+            </w:r>
+          </w:p>
+        </w:tc>
+        <w:tc>
+          <w:tcPr>
+            <w:tcW w:type="pct" w:w="27.624309392265197%"/>
+            <w:tcBorders>
+              <w:top w:val="single" w:color="E1E7EF" w:sz="1"/>
+              <w:left w:val="single" w:color="E1E7EF" w:sz="1"/>
+              <w:bottom w:val="single" w:color="E1E7EF" w:sz="1"/>
+              <w:right w:val="single" w:color="E1E7EF" w:sz="1"/>
+            </w:tcBorders>
+            <w:tcMar>
+              <w:top w:type="dxa" w:w="60"/>
+              <w:left w:type="dxa" w:w="90"/>
+              <w:bottom w:type="dxa" w:w="60"/>
+              <w:right w:type="dxa" w:w="90"/>
+            </w:tcMar>
+          </w:tcPr>
+          <w:p>
+            <w:r>
+              <w:rPr>
+                <w:color w:val="0B1524"/>
+                <w:sz w:val="17"/>
+                <w:szCs w:val="17"/>
+              </w:rPr>
+              <w:t xml:space="preserve">Risk tier High (score 4.5). Never audited.</w:t>
+            </w:r>
+          </w:p>
+        </w:tc>
+      </w:tr>
+      <w:tr>
+        <w:tc>
+          <w:tcPr>
+            <w:tcW w:type="pct" w:w="4.972375690607735%"/>
+            <w:tcBorders>
+              <w:top w:val="single" w:color="E1E7EF" w:sz="1"/>
+              <w:left w:val="single" w:color="E1E7EF" w:sz="1"/>
+              <w:bottom w:val="single" w:color="E1E7EF" w:sz="1"/>
+              <w:right w:val="single" w:color="E1E7EF" w:sz="1"/>
+            </w:tcBorders>
+            <w:tcMar>
+              <w:top w:type="dxa" w:w="60"/>
+              <w:left w:type="dxa" w:w="90"/>
+              <w:bottom w:type="dxa" w:w="60"/>
+              <w:right w:type="dxa" w:w="90"/>
+            </w:tcMar>
+          </w:tcPr>
+          <w:p>
+            <w:r>
+              <w:rPr>
+                <w:color w:val="0B1524"/>
+                <w:sz w:val="17"/>
+                <w:szCs w:val="17"/>
+              </w:rPr>
+              <w:t xml:space="preserve">Q2</w:t>
+            </w:r>
+          </w:p>
+        </w:tc>
+        <w:tc>
+          <w:tcPr>
+            <w:tcW w:type="pct" w:w="22.099447513812155%"/>
+            <w:tcBorders>
+              <w:top w:val="single" w:color="E1E7EF" w:sz="1"/>
+              <w:left w:val="single" w:color="E1E7EF" w:sz="1"/>
+              <w:bottom w:val="single" w:color="E1E7EF" w:sz="1"/>
+              <w:right w:val="single" w:color="E1E7EF" w:sz="1"/>
+            </w:tcBorders>
+            <w:tcMar>
+              <w:top w:type="dxa" w:w="60"/>
+              <w:left w:type="dxa" w:w="90"/>
+              <w:bottom w:type="dxa" w:w="60"/>
+              <w:right w:type="dxa" w:w="90"/>
+            </w:tcMar>
+          </w:tcPr>
+          <w:p>
+            <w:r>
+              <w:rPr>
+                <w:color w:val="0B1524"/>
+                <w:sz w:val="17"/>
+                <w:szCs w:val="17"/>
+              </w:rPr>
+              <w:t xml:space="preserve">Treasury and cash management</w:t>
+            </w:r>
+          </w:p>
+        </w:tc>
+        <w:tc>
+          <w:tcPr>
+            <w:tcW w:type="pct" w:w="7.734806629834254%"/>
+            <w:tcBorders>
+              <w:top w:val="single" w:color="E1E7EF" w:sz="1"/>
+              <w:left w:val="single" w:color="E1E7EF" w:sz="1"/>
+              <w:bottom w:val="single" w:color="E1E7EF" w:sz="1"/>
+              <w:right w:val="single" w:color="E1E7EF" w:sz="1"/>
+            </w:tcBorders>
+            <w:tcMar>
+              <w:top w:type="dxa" w:w="60"/>
+              <w:left w:type="dxa" w:w="90"/>
+              <w:bottom w:type="dxa" w:w="60"/>
+              <w:right w:type="dxa" w:w="90"/>
+            </w:tcMar>
+          </w:tcPr>
+          <w:p>
+            <w:r>
+              <w:rPr>
+                <w:color w:val="0B1524"/>
+                <w:sz w:val="17"/>
+                <w:szCs w:val="17"/>
+              </w:rPr>
+              <w:t xml:space="preserve">Process</w:t>
+            </w:r>
+          </w:p>
+        </w:tc>
+        <w:tc>
+          <w:tcPr>
+            <w:tcW w:type="pct" w:w="6.077348066298343%"/>
+            <w:tcBorders>
+              <w:top w:val="single" w:color="E1E7EF" w:sz="1"/>
+              <w:left w:val="single" w:color="E1E7EF" w:sz="1"/>
+              <w:bottom w:val="single" w:color="E1E7EF" w:sz="1"/>
+              <w:right w:val="single" w:color="E1E7EF" w:sz="1"/>
+            </w:tcBorders>
+            <w:tcMar>
+              <w:top w:type="dxa" w:w="60"/>
+              <w:left w:type="dxa" w:w="90"/>
+              <w:bottom w:type="dxa" w:w="60"/>
+              <w:right w:type="dxa" w:w="90"/>
+            </w:tcMar>
+          </w:tcPr>
+          <w:p>
+            <w:r>
+              <w:rPr>
+                <w:color w:val="0B1524"/>
+                <w:sz w:val="17"/>
+                <w:szCs w:val="17"/>
+              </w:rPr>
+              <w:t xml:space="preserve">3.83</w:t>
+            </w:r>
+          </w:p>
+        </w:tc>
+        <w:tc>
+          <w:tcPr>
+            <w:tcW w:type="pct" w:w="5.524861878453039%"/>
+            <w:tcBorders>
+              <w:top w:val="single" w:color="E1E7EF" w:sz="1"/>
+              <w:left w:val="single" w:color="E1E7EF" w:sz="1"/>
+              <w:bottom w:val="single" w:color="E1E7EF" w:sz="1"/>
+              <w:right w:val="single" w:color="E1E7EF" w:sz="1"/>
+            </w:tcBorders>
+            <w:tcMar>
+              <w:top w:type="dxa" w:w="60"/>
+              <w:left w:type="dxa" w:w="90"/>
+              <w:bottom w:type="dxa" w:w="60"/>
+              <w:right w:type="dxa" w:w="90"/>
+            </w:tcMar>
+          </w:tcPr>
+          <w:p>
+            <w:r>
+              <w:rPr>
+                <w:color w:val="0B1524"/>
+                <w:sz w:val="17"/>
+                <w:szCs w:val="17"/>
+              </w:rPr>
+              <w:t xml:space="preserve">Medium</w:t>
+            </w:r>
+          </w:p>
+        </w:tc>
+        <w:tc>
+          <w:tcPr>
+            <w:tcW w:type="pct" w:w="7.18232044198895%"/>
+            <w:tcBorders>
+              <w:top w:val="single" w:color="E1E7EF" w:sz="1"/>
+              <w:left w:val="single" w:color="E1E7EF" w:sz="1"/>
+              <w:bottom w:val="single" w:color="E1E7EF" w:sz="1"/>
+              <w:right w:val="single" w:color="E1E7EF" w:sz="1"/>
+            </w:tcBorders>
+            <w:tcMar>
+              <w:top w:type="dxa" w:w="60"/>
+              <w:left w:type="dxa" w:w="90"/>
+              <w:bottom w:type="dxa" w:w="60"/>
+              <w:right w:type="dxa" w:w="90"/>
+            </w:tcMar>
+          </w:tcPr>
+          <w:p>
+            <w:r>
+              <w:rPr>
+                <w:color w:val="0B1524"/>
+                <w:sz w:val="17"/>
+                <w:szCs w:val="17"/>
+              </w:rPr>
+              <w:t xml:space="preserve">100</w:t>
+            </w:r>
+          </w:p>
+        </w:tc>
+        <w:tc>
+          <w:tcPr>
+            <w:tcW w:type="pct" w:w="11.049723756906078%"/>
+            <w:tcBorders>
+              <w:top w:val="single" w:color="E1E7EF" w:sz="1"/>
+              <w:left w:val="single" w:color="E1E7EF" w:sz="1"/>
+              <w:bottom w:val="single" w:color="E1E7EF" w:sz="1"/>
+              <w:right w:val="single" w:color="E1E7EF" w:sz="1"/>
+            </w:tcBorders>
+            <w:tcMar>
+              <w:top w:type="dxa" w:w="60"/>
+              <w:left w:type="dxa" w:w="90"/>
+              <w:bottom w:type="dxa" w:w="60"/>
+              <w:right w:type="dxa" w:w="90"/>
+            </w:tcMar>
+          </w:tcPr>
+          <w:p>
+            <w:r>
+              <w:rPr>
+                <w:color w:val="0B1524"/>
+                <w:sz w:val="17"/>
+                <w:szCs w:val="17"/>
+              </w:rPr>
+              <w:t xml:space="preserve">Mahmoud Abdulaziz</w:t>
+            </w:r>
+          </w:p>
+        </w:tc>
+        <w:tc>
+          <w:tcPr>
+            <w:tcW w:type="pct" w:w="7.734806629834254%"/>
+            <w:tcBorders>
+              <w:top w:val="single" w:color="E1E7EF" w:sz="1"/>
+              <w:left w:val="single" w:color="E1E7EF" w:sz="1"/>
+              <w:bottom w:val="single" w:color="E1E7EF" w:sz="1"/>
+              <w:right w:val="single" w:color="E1E7EF" w:sz="1"/>
+            </w:tcBorders>
+            <w:tcMar>
+              <w:top w:type="dxa" w:w="60"/>
+              <w:left w:type="dxa" w:w="90"/>
+              <w:bottom w:type="dxa" w:w="60"/>
+              <w:right w:type="dxa" w:w="90"/>
+            </w:tcMar>
+          </w:tcPr>
+          <w:p>
+            <w:r>
+              <w:rPr>
+                <w:color w:val="0B1524"/>
+                <w:sz w:val="17"/>
+                <w:szCs w:val="17"/>
+              </w:rPr>
+              <w:t xml:space="preserve">Planned</w:t>
+            </w:r>
+          </w:p>
+        </w:tc>
+        <w:tc>
+          <w:tcPr>
+            <w:tcW w:type="pct" w:w="27.624309392265197%"/>
+            <w:tcBorders>
+              <w:top w:val="single" w:color="E1E7EF" w:sz="1"/>
+              <w:left w:val="single" w:color="E1E7EF" w:sz="1"/>
+              <w:bottom w:val="single" w:color="E1E7EF" w:sz="1"/>
+              <w:right w:val="single" w:color="E1E7EF" w:sz="1"/>
+            </w:tcBorders>
+            <w:tcMar>
+              <w:top w:type="dxa" w:w="60"/>
+              <w:left w:type="dxa" w:w="90"/>
+              <w:bottom w:type="dxa" w:w="60"/>
+              <w:right w:type="dxa" w:w="90"/>
+            </w:tcMar>
+          </w:tcPr>
+          <w:p>
+            <w:r>
+              <w:rPr>
+                <w:color w:val="0B1524"/>
+                <w:sz w:val="17"/>
+                <w:szCs w:val="17"/>
+              </w:rPr>
+              <w:t xml:space="preserve">Risk tier Medium (score 3.83).</w:t>
+            </w:r>
+          </w:p>
+        </w:tc>
+      </w:tr>
+      <w:tr>
+        <w:tc>
+          <w:tcPr>
+            <w:tcW w:type="pct" w:w="4.972375690607735%"/>
+            <w:tcBorders>
+              <w:top w:val="single" w:color="E1E7EF" w:sz="1"/>
+              <w:left w:val="single" w:color="E1E7EF" w:sz="1"/>
+              <w:bottom w:val="single" w:color="E1E7EF" w:sz="1"/>
+              <w:right w:val="single" w:color="E1E7EF" w:sz="1"/>
+            </w:tcBorders>
+            <w:tcMar>
+              <w:top w:type="dxa" w:w="60"/>
+              <w:left w:type="dxa" w:w="90"/>
+              <w:bottom w:type="dxa" w:w="60"/>
+              <w:right w:type="dxa" w:w="90"/>
+            </w:tcMar>
+          </w:tcPr>
+          <w:p>
+            <w:r>
+              <w:rPr>
+                <w:color w:val="0B1524"/>
+                <w:sz w:val="17"/>
+                <w:szCs w:val="17"/>
+              </w:rPr>
+              <w:t xml:space="preserve">Q3</w:t>
+            </w:r>
+          </w:p>
+        </w:tc>
+        <w:tc>
+          <w:tcPr>
+            <w:tcW w:type="pct" w:w="22.099447513812155%"/>
+            <w:tcBorders>
+              <w:top w:val="single" w:color="E1E7EF" w:sz="1"/>
+              <w:left w:val="single" w:color="E1E7EF" w:sz="1"/>
+              <w:bottom w:val="single" w:color="E1E7EF" w:sz="1"/>
+              <w:right w:val="single" w:color="E1E7EF" w:sz="1"/>
+            </w:tcBorders>
+            <w:tcMar>
+              <w:top w:type="dxa" w:w="60"/>
+              <w:left w:type="dxa" w:w="90"/>
+              <w:bottom w:type="dxa" w:w="60"/>
+              <w:right w:type="dxa" w:w="90"/>
+            </w:tcMar>
+          </w:tcPr>
+          <w:p>
+            <w:r>
+              <w:rPr>
+                <w:color w:val="0B1524"/>
+                <w:sz w:val="17"/>
+                <w:szCs w:val="17"/>
+              </w:rPr>
+              <w:t xml:space="preserve">Business continuity and recovery</w:t>
+            </w:r>
+          </w:p>
+        </w:tc>
+        <w:tc>
+          <w:tcPr>
+            <w:tcW w:type="pct" w:w="7.734806629834254%"/>
+            <w:tcBorders>
+              <w:top w:val="single" w:color="E1E7EF" w:sz="1"/>
+              <w:left w:val="single" w:color="E1E7EF" w:sz="1"/>
+              <w:bottom w:val="single" w:color="E1E7EF" w:sz="1"/>
+              <w:right w:val="single" w:color="E1E7EF" w:sz="1"/>
+            </w:tcBorders>
+            <w:tcMar>
+              <w:top w:type="dxa" w:w="60"/>
+              <w:left w:type="dxa" w:w="90"/>
+              <w:bottom w:type="dxa" w:w="60"/>
+              <w:right w:type="dxa" w:w="90"/>
+            </w:tcMar>
+          </w:tcPr>
+          <w:p>
+            <w:r>
+              <w:rPr>
+                <w:color w:val="0B1524"/>
+                <w:sz w:val="17"/>
+                <w:szCs w:val="17"/>
+              </w:rPr>
+              <w:t xml:space="preserve">Process</w:t>
+            </w:r>
+          </w:p>
+        </w:tc>
+        <w:tc>
+          <w:tcPr>
+            <w:tcW w:type="pct" w:w="6.077348066298343%"/>
+            <w:tcBorders>
+              <w:top w:val="single" w:color="E1E7EF" w:sz="1"/>
+              <w:left w:val="single" w:color="E1E7EF" w:sz="1"/>
+              <w:bottom w:val="single" w:color="E1E7EF" w:sz="1"/>
+              <w:right w:val="single" w:color="E1E7EF" w:sz="1"/>
+            </w:tcBorders>
+            <w:tcMar>
+              <w:top w:type="dxa" w:w="60"/>
+              <w:left w:type="dxa" w:w="90"/>
+              <w:bottom w:type="dxa" w:w="60"/>
+              <w:right w:type="dxa" w:w="90"/>
+            </w:tcMar>
+          </w:tcPr>
+          <w:p>
+            <w:r>
+              <w:rPr>
+                <w:color w:val="0B1524"/>
+                <w:sz w:val="17"/>
+                <w:szCs w:val="17"/>
+              </w:rPr>
+              <w:t xml:space="preserve">3.57</w:t>
+            </w:r>
+          </w:p>
+        </w:tc>
+        <w:tc>
+          <w:tcPr>
+            <w:tcW w:type="pct" w:w="5.524861878453039%"/>
+            <w:tcBorders>
+              <w:top w:val="single" w:color="E1E7EF" w:sz="1"/>
+              <w:left w:val="single" w:color="E1E7EF" w:sz="1"/>
+              <w:bottom w:val="single" w:color="E1E7EF" w:sz="1"/>
+              <w:right w:val="single" w:color="E1E7EF" w:sz="1"/>
+            </w:tcBorders>
+            <w:tcMar>
+              <w:top w:type="dxa" w:w="60"/>
+              <w:left w:type="dxa" w:w="90"/>
+              <w:bottom w:type="dxa" w:w="60"/>
+              <w:right w:type="dxa" w:w="90"/>
+            </w:tcMar>
+          </w:tcPr>
+          <w:p>
+            <w:r>
+              <w:rPr>
+                <w:color w:val="0B1524"/>
+                <w:sz w:val="17"/>
+                <w:szCs w:val="17"/>
+              </w:rPr>
+              <w:t xml:space="preserve">Medium</w:t>
+            </w:r>
+          </w:p>
+        </w:tc>
+        <w:tc>
+          <w:tcPr>
+            <w:tcW w:type="pct" w:w="7.18232044198895%"/>
+            <w:tcBorders>
+              <w:top w:val="single" w:color="E1E7EF" w:sz="1"/>
+              <w:left w:val="single" w:color="E1E7EF" w:sz="1"/>
+              <w:bottom w:val="single" w:color="E1E7EF" w:sz="1"/>
+              <w:right w:val="single" w:color="E1E7EF" w:sz="1"/>
+            </w:tcBorders>
+            <w:tcMar>
+              <w:top w:type="dxa" w:w="60"/>
+              <w:left w:type="dxa" w:w="90"/>
+              <w:bottom w:type="dxa" w:w="60"/>
+              <w:right w:type="dxa" w:w="90"/>
+            </w:tcMar>
+          </w:tcPr>
+          <w:p>
+            <w:r>
+              <w:rPr>
+                <w:color w:val="0B1524"/>
+                <w:sz w:val="17"/>
+                <w:szCs w:val="17"/>
+              </w:rPr>
+              <w:t xml:space="preserve">100</w:t>
+            </w:r>
+          </w:p>
+        </w:tc>
+        <w:tc>
+          <w:tcPr>
+            <w:tcW w:type="pct" w:w="11.049723756906078%"/>
+            <w:tcBorders>
+              <w:top w:val="single" w:color="E1E7EF" w:sz="1"/>
+              <w:left w:val="single" w:color="E1E7EF" w:sz="1"/>
+              <w:bottom w:val="single" w:color="E1E7EF" w:sz="1"/>
+              <w:right w:val="single" w:color="E1E7EF" w:sz="1"/>
+            </w:tcBorders>
+            <w:tcMar>
+              <w:top w:type="dxa" w:w="60"/>
+              <w:left w:type="dxa" w:w="90"/>
+              <w:bottom w:type="dxa" w:w="60"/>
+              <w:right w:type="dxa" w:w="90"/>
+            </w:tcMar>
+          </w:tcPr>
+          <w:p>
+            <w:r>
+              <w:rPr>
+                <w:color w:val="0B1524"/>
+                <w:sz w:val="17"/>
+                <w:szCs w:val="17"/>
+              </w:rPr>
+              <w:t xml:space="preserve">Mahmoud Abdulaziz</w:t>
+            </w:r>
+          </w:p>
+        </w:tc>
+        <w:tc>
+          <w:tcPr>
+            <w:tcW w:type="pct" w:w="7.734806629834254%"/>
+            <w:tcBorders>
+              <w:top w:val="single" w:color="E1E7EF" w:sz="1"/>
+              <w:left w:val="single" w:color="E1E7EF" w:sz="1"/>
+              <w:bottom w:val="single" w:color="E1E7EF" w:sz="1"/>
+              <w:right w:val="single" w:color="E1E7EF" w:sz="1"/>
+            </w:tcBorders>
+            <w:tcMar>
+              <w:top w:type="dxa" w:w="60"/>
+              <w:left w:type="dxa" w:w="90"/>
+              <w:bottom w:type="dxa" w:w="60"/>
+              <w:right w:type="dxa" w:w="90"/>
+            </w:tcMar>
+          </w:tcPr>
+          <w:p>
+            <w:r>
+              <w:rPr>
+                <w:color w:val="0B1524"/>
+                <w:sz w:val="17"/>
+                <w:szCs w:val="17"/>
+              </w:rPr>
+              <w:t xml:space="preserve">Planned</w:t>
+            </w:r>
+          </w:p>
+        </w:tc>
+        <w:tc>
+          <w:tcPr>
+            <w:tcW w:type="pct" w:w="27.624309392265197%"/>
+            <w:tcBorders>
+              <w:top w:val="single" w:color="E1E7EF" w:sz="1"/>
+              <w:left w:val="single" w:color="E1E7EF" w:sz="1"/>
+              <w:bottom w:val="single" w:color="E1E7EF" w:sz="1"/>
+              <w:right w:val="single" w:color="E1E7EF" w:sz="1"/>
+            </w:tcBorders>
+            <w:tcMar>
+              <w:top w:type="dxa" w:w="60"/>
+              <w:left w:type="dxa" w:w="90"/>
+              <w:bottom w:type="dxa" w:w="60"/>
+              <w:right w:type="dxa" w:w="90"/>
+            </w:tcMar>
+          </w:tcPr>
+          <w:p>
+            <w:r>
+              <w:rPr>
+                <w:color w:val="0B1524"/>
+                <w:sz w:val="17"/>
+                <w:szCs w:val="17"/>
+              </w:rPr>
+              <w:t xml:space="preserve">Risk tier Medium (score 3.57).</w:t>
+            </w:r>
+          </w:p>
+        </w:tc>
+      </w:tr>
+      <w:tr>
+        <w:tc>
+          <w:tcPr>
+            <w:tcW w:type="pct" w:w="4.972375690607735%"/>
+            <w:tcBorders>
+              <w:top w:val="single" w:color="E1E7EF" w:sz="1"/>
+              <w:left w:val="single" w:color="E1E7EF" w:sz="1"/>
+              <w:bottom w:val="single" w:color="E1E7EF" w:sz="1"/>
+              <w:right w:val="single" w:color="E1E7EF" w:sz="1"/>
+            </w:tcBorders>
+            <w:tcMar>
+              <w:top w:type="dxa" w:w="60"/>
+              <w:left w:type="dxa" w:w="90"/>
+              <w:bottom w:type="dxa" w:w="60"/>
+              <w:right w:type="dxa" w:w="90"/>
+            </w:tcMar>
+          </w:tcPr>
+          <w:p>
+            <w:r>
+              <w:rPr>
+                <w:color w:val="0B1524"/>
+                <w:sz w:val="17"/>
+                <w:szCs w:val="17"/>
+              </w:rPr>
+              <w:t xml:space="preserve">Q3</w:t>
+            </w:r>
+          </w:p>
+        </w:tc>
+        <w:tc>
+          <w:tcPr>
+            <w:tcW w:type="pct" w:w="22.099447513812155%"/>
+            <w:tcBorders>
+              <w:top w:val="single" w:color="E1E7EF" w:sz="1"/>
+              <w:left w:val="single" w:color="E1E7EF" w:sz="1"/>
+              <w:bottom w:val="single" w:color="E1E7EF" w:sz="1"/>
+              <w:right w:val="single" w:color="E1E7EF" w:sz="1"/>
+            </w:tcBorders>
+            <w:tcMar>
+              <w:top w:type="dxa" w:w="60"/>
+              <w:left w:type="dxa" w:w="90"/>
+              <w:bottom w:type="dxa" w:w="60"/>
+              <w:right w:type="dxa" w:w="90"/>
+            </w:tcMar>
+          </w:tcPr>
+          <w:p>
+            <w:r>
+              <w:rPr>
+                <w:color w:val="0B1524"/>
+                <w:sz w:val="17"/>
+                <w:szCs w:val="17"/>
+              </w:rPr>
+              <w:t xml:space="preserve">Identity and access management</w:t>
+            </w:r>
+          </w:p>
+        </w:tc>
+        <w:tc>
+          <w:tcPr>
+            <w:tcW w:type="pct" w:w="7.734806629834254%"/>
+            <w:tcBorders>
+              <w:top w:val="single" w:color="E1E7EF" w:sz="1"/>
+              <w:left w:val="single" w:color="E1E7EF" w:sz="1"/>
+              <w:bottom w:val="single" w:color="E1E7EF" w:sz="1"/>
+              <w:right w:val="single" w:color="E1E7EF" w:sz="1"/>
+            </w:tcBorders>
+            <w:tcMar>
+              <w:top w:type="dxa" w:w="60"/>
+              <w:left w:type="dxa" w:w="90"/>
+              <w:bottom w:type="dxa" w:w="60"/>
+              <w:right w:type="dxa" w:w="90"/>
+            </w:tcMar>
+          </w:tcPr>
+          <w:p>
+            <w:r>
+              <w:rPr>
+                <w:color w:val="0B1524"/>
+                <w:sz w:val="17"/>
+                <w:szCs w:val="17"/>
+              </w:rPr>
+              <w:t xml:space="preserve">Process</w:t>
+            </w:r>
+          </w:p>
+        </w:tc>
+        <w:tc>
+          <w:tcPr>
+            <w:tcW w:type="pct" w:w="6.077348066298343%"/>
+            <w:tcBorders>
+              <w:top w:val="single" w:color="E1E7EF" w:sz="1"/>
+              <w:left w:val="single" w:color="E1E7EF" w:sz="1"/>
+              <w:bottom w:val="single" w:color="E1E7EF" w:sz="1"/>
+              <w:right w:val="single" w:color="E1E7EF" w:sz="1"/>
+            </w:tcBorders>
+            <w:tcMar>
+              <w:top w:type="dxa" w:w="60"/>
+              <w:left w:type="dxa" w:w="90"/>
+              <w:bottom w:type="dxa" w:w="60"/>
+              <w:right w:type="dxa" w:w="90"/>
+            </w:tcMar>
+          </w:tcPr>
+          <w:p>
+            <w:r>
+              <w:rPr>
+                <w:color w:val="0B1524"/>
+                <w:sz w:val="17"/>
+                <w:szCs w:val="17"/>
+              </w:rPr>
+              <w:t xml:space="preserve">4.35</w:t>
+            </w:r>
+          </w:p>
+        </w:tc>
+        <w:tc>
+          <w:tcPr>
+            <w:tcW w:type="pct" w:w="5.524861878453039%"/>
+            <w:tcBorders>
+              <w:top w:val="single" w:color="E1E7EF" w:sz="1"/>
+              <w:left w:val="single" w:color="E1E7EF" w:sz="1"/>
+              <w:bottom w:val="single" w:color="E1E7EF" w:sz="1"/>
+              <w:right w:val="single" w:color="E1E7EF" w:sz="1"/>
+            </w:tcBorders>
+            <w:tcMar>
+              <w:top w:type="dxa" w:w="60"/>
+              <w:left w:type="dxa" w:w="90"/>
+              <w:bottom w:type="dxa" w:w="60"/>
+              <w:right w:type="dxa" w:w="90"/>
+            </w:tcMar>
+          </w:tcPr>
+          <w:p>
+            <w:r>
+              <w:rPr>
+                <w:color w:val="0B1524"/>
+                <w:sz w:val="17"/>
+                <w:szCs w:val="17"/>
+              </w:rPr>
+              <w:t xml:space="preserve">High</w:t>
+            </w:r>
+          </w:p>
+        </w:tc>
+        <w:tc>
+          <w:tcPr>
+            <w:tcW w:type="pct" w:w="7.18232044198895%"/>
+            <w:tcBorders>
+              <w:top w:val="single" w:color="E1E7EF" w:sz="1"/>
+              <w:left w:val="single" w:color="E1E7EF" w:sz="1"/>
+              <w:bottom w:val="single" w:color="E1E7EF" w:sz="1"/>
+              <w:right w:val="single" w:color="E1E7EF" w:sz="1"/>
+            </w:tcBorders>
+            <w:tcMar>
+              <w:top w:type="dxa" w:w="60"/>
+              <w:left w:type="dxa" w:w="90"/>
+              <w:bottom w:type="dxa" w:w="60"/>
+              <w:right w:type="dxa" w:w="90"/>
+            </w:tcMar>
+          </w:tcPr>
+          <w:p>
+            <w:r>
+              <w:rPr>
+                <w:color w:val="0B1524"/>
+                <w:sz w:val="17"/>
+                <w:szCs w:val="17"/>
+              </w:rPr>
+              <w:t xml:space="preserve">160</w:t>
+            </w:r>
+          </w:p>
+        </w:tc>
+        <w:tc>
+          <w:tcPr>
+            <w:tcW w:type="pct" w:w="11.049723756906078%"/>
+            <w:tcBorders>
+              <w:top w:val="single" w:color="E1E7EF" w:sz="1"/>
+              <w:left w:val="single" w:color="E1E7EF" w:sz="1"/>
+              <w:bottom w:val="single" w:color="E1E7EF" w:sz="1"/>
+              <w:right w:val="single" w:color="E1E7EF" w:sz="1"/>
+            </w:tcBorders>
+            <w:tcMar>
+              <w:top w:type="dxa" w:w="60"/>
+              <w:left w:type="dxa" w:w="90"/>
+              <w:bottom w:type="dxa" w:w="60"/>
+              <w:right w:type="dxa" w:w="90"/>
+            </w:tcMar>
+          </w:tcPr>
+          <w:p>
+            <w:r>
+              <w:rPr>
+                <w:color w:val="0B1524"/>
+                <w:sz w:val="17"/>
+                <w:szCs w:val="17"/>
+              </w:rPr>
+              <w:t xml:space="preserve">Mahmoud Abdulaziz</w:t>
+            </w:r>
+          </w:p>
+        </w:tc>
+        <w:tc>
+          <w:tcPr>
+            <w:tcW w:type="pct" w:w="7.734806629834254%"/>
+            <w:tcBorders>
+              <w:top w:val="single" w:color="E1E7EF" w:sz="1"/>
+              <w:left w:val="single" w:color="E1E7EF" w:sz="1"/>
+              <w:bottom w:val="single" w:color="E1E7EF" w:sz="1"/>
+              <w:right w:val="single" w:color="E1E7EF" w:sz="1"/>
+            </w:tcBorders>
+            <w:tcMar>
+              <w:top w:type="dxa" w:w="60"/>
+              <w:left w:type="dxa" w:w="90"/>
+              <w:bottom w:type="dxa" w:w="60"/>
+              <w:right w:type="dxa" w:w="90"/>
+            </w:tcMar>
+          </w:tcPr>
+          <w:p>
+            <w:r>
+              <w:rPr>
+                <w:color w:val="0B1524"/>
+                <w:sz w:val="17"/>
+                <w:szCs w:val="17"/>
+              </w:rPr>
+              <w:t xml:space="preserve">Planned</w:t>
+            </w:r>
+          </w:p>
+        </w:tc>
+        <w:tc>
+          <w:tcPr>
+            <w:tcW w:type="pct" w:w="27.624309392265197%"/>
+            <w:tcBorders>
+              <w:top w:val="single" w:color="E1E7EF" w:sz="1"/>
+              <w:left w:val="single" w:color="E1E7EF" w:sz="1"/>
+              <w:bottom w:val="single" w:color="E1E7EF" w:sz="1"/>
+              <w:right w:val="single" w:color="E1E7EF" w:sz="1"/>
+            </w:tcBorders>
+            <w:tcMar>
+              <w:top w:type="dxa" w:w="60"/>
+              <w:left w:type="dxa" w:w="90"/>
+              <w:bottom w:type="dxa" w:w="60"/>
+              <w:right w:type="dxa" w:w="90"/>
+            </w:tcMar>
+          </w:tcPr>
+          <w:p>
+            <w:r>
+              <w:rPr>
+                <w:color w:val="0B1524"/>
+                <w:sz w:val="17"/>
+                <w:szCs w:val="17"/>
+              </w:rPr>
+              <w:t xml:space="preserve">Risk tier High (score 4.35).</w:t>
+            </w:r>
+          </w:p>
+        </w:tc>
+      </w:tr>
+      <w:tr>
+        <w:tc>
+          <w:tcPr>
+            <w:tcW w:type="pct" w:w="4.972375690607735%"/>
+            <w:tcBorders>
+              <w:top w:val="single" w:color="E1E7EF" w:sz="1"/>
+              <w:left w:val="single" w:color="E1E7EF" w:sz="1"/>
+              <w:bottom w:val="single" w:color="E1E7EF" w:sz="1"/>
+              <w:right w:val="single" w:color="E1E7EF" w:sz="1"/>
+            </w:tcBorders>
+            <w:tcMar>
+              <w:top w:type="dxa" w:w="60"/>
+              <w:left w:type="dxa" w:w="90"/>
+              <w:bottom w:type="dxa" w:w="60"/>
+              <w:right w:type="dxa" w:w="90"/>
+            </w:tcMar>
+          </w:tcPr>
+          <w:p>
+            <w:r>
+              <w:rPr>
+                <w:color w:val="0B1524"/>
+                <w:sz w:val="17"/>
+                <w:szCs w:val="17"/>
+              </w:rPr>
+              <w:t xml:space="preserve">Q4</w:t>
+            </w:r>
+          </w:p>
+        </w:tc>
+        <w:tc>
+          <w:tcPr>
+            <w:tcW w:type="pct" w:w="22.099447513812155%"/>
+            <w:tcBorders>
+              <w:top w:val="single" w:color="E1E7EF" w:sz="1"/>
+              <w:left w:val="single" w:color="E1E7EF" w:sz="1"/>
+              <w:bottom w:val="single" w:color="E1E7EF" w:sz="1"/>
+              <w:right w:val="single" w:color="E1E7EF" w:sz="1"/>
+            </w:tcBorders>
+            <w:tcMar>
+              <w:top w:type="dxa" w:w="60"/>
+              <w:left w:type="dxa" w:w="90"/>
+              <w:bottom w:type="dxa" w:w="60"/>
+              <w:right w:type="dxa" w:w="90"/>
+            </w:tcMar>
+          </w:tcPr>
+          <w:p>
+            <w:r>
+              <w:rPr>
+                <w:color w:val="0B1524"/>
+                <w:sz w:val="17"/>
+                <w:szCs w:val="17"/>
+              </w:rPr>
+              <w:t xml:space="preserve">Payroll and HR operations</w:t>
+            </w:r>
+          </w:p>
+        </w:tc>
+        <w:tc>
+          <w:tcPr>
+            <w:tcW w:type="pct" w:w="7.734806629834254%"/>
+            <w:tcBorders>
+              <w:top w:val="single" w:color="E1E7EF" w:sz="1"/>
+              <w:left w:val="single" w:color="E1E7EF" w:sz="1"/>
+              <w:bottom w:val="single" w:color="E1E7EF" w:sz="1"/>
+              <w:right w:val="single" w:color="E1E7EF" w:sz="1"/>
+            </w:tcBorders>
+            <w:tcMar>
+              <w:top w:type="dxa" w:w="60"/>
+              <w:left w:type="dxa" w:w="90"/>
+              <w:bottom w:type="dxa" w:w="60"/>
+              <w:right w:type="dxa" w:w="90"/>
+            </w:tcMar>
+          </w:tcPr>
+          <w:p>
+            <w:r>
+              <w:rPr>
+                <w:color w:val="0B1524"/>
+                <w:sz w:val="17"/>
+                <w:szCs w:val="17"/>
+              </w:rPr>
+              <w:t xml:space="preserve">Process</w:t>
+            </w:r>
+          </w:p>
+        </w:tc>
+        <w:tc>
+          <w:tcPr>
+            <w:tcW w:type="pct" w:w="6.077348066298343%"/>
+            <w:tcBorders>
+              <w:top w:val="single" w:color="E1E7EF" w:sz="1"/>
+              <w:left w:val="single" w:color="E1E7EF" w:sz="1"/>
+              <w:bottom w:val="single" w:color="E1E7EF" w:sz="1"/>
+              <w:right w:val="single" w:color="E1E7EF" w:sz="1"/>
+            </w:tcBorders>
+            <w:tcMar>
+              <w:top w:type="dxa" w:w="60"/>
+              <w:left w:type="dxa" w:w="90"/>
+              <w:bottom w:type="dxa" w:w="60"/>
+              <w:right w:type="dxa" w:w="90"/>
+            </w:tcMar>
+          </w:tcPr>
+          <w:p>
+            <w:r>
+              <w:rPr>
+                <w:color w:val="0B1524"/>
+                <w:sz w:val="17"/>
+                <w:szCs w:val="17"/>
+              </w:rPr>
+              <w:t xml:space="preserve">3.5</w:t>
+            </w:r>
+          </w:p>
+        </w:tc>
+        <w:tc>
+          <w:tcPr>
+            <w:tcW w:type="pct" w:w="5.524861878453039%"/>
+            <w:tcBorders>
+              <w:top w:val="single" w:color="E1E7EF" w:sz="1"/>
+              <w:left w:val="single" w:color="E1E7EF" w:sz="1"/>
+              <w:bottom w:val="single" w:color="E1E7EF" w:sz="1"/>
+              <w:right w:val="single" w:color="E1E7EF" w:sz="1"/>
+            </w:tcBorders>
+            <w:tcMar>
+              <w:top w:type="dxa" w:w="60"/>
+              <w:left w:type="dxa" w:w="90"/>
+              <w:bottom w:type="dxa" w:w="60"/>
+              <w:right w:type="dxa" w:w="90"/>
+            </w:tcMar>
+          </w:tcPr>
+          <w:p>
+            <w:r>
+              <w:rPr>
+                <w:color w:val="0B1524"/>
+                <w:sz w:val="17"/>
+                <w:szCs w:val="17"/>
+              </w:rPr>
+              <w:t xml:space="preserve">Medium</w:t>
+            </w:r>
+          </w:p>
+        </w:tc>
+        <w:tc>
+          <w:tcPr>
+            <w:tcW w:type="pct" w:w="7.18232044198895%"/>
+            <w:tcBorders>
+              <w:top w:val="single" w:color="E1E7EF" w:sz="1"/>
+              <w:left w:val="single" w:color="E1E7EF" w:sz="1"/>
+              <w:bottom w:val="single" w:color="E1E7EF" w:sz="1"/>
+              <w:right w:val="single" w:color="E1E7EF" w:sz="1"/>
+            </w:tcBorders>
+            <w:tcMar>
+              <w:top w:type="dxa" w:w="60"/>
+              <w:left w:type="dxa" w:w="90"/>
+              <w:bottom w:type="dxa" w:w="60"/>
+              <w:right w:type="dxa" w:w="90"/>
+            </w:tcMar>
+          </w:tcPr>
+          <w:p>
+            <w:r>
+              <w:rPr>
+                <w:color w:val="0B1524"/>
+                <w:sz w:val="17"/>
+                <w:szCs w:val="17"/>
+              </w:rPr>
+              <w:t xml:space="preserve">100</w:t>
+            </w:r>
+          </w:p>
+        </w:tc>
+        <w:tc>
+          <w:tcPr>
+            <w:tcW w:type="pct" w:w="11.049723756906078%"/>
+            <w:tcBorders>
+              <w:top w:val="single" w:color="E1E7EF" w:sz="1"/>
+              <w:left w:val="single" w:color="E1E7EF" w:sz="1"/>
+              <w:bottom w:val="single" w:color="E1E7EF" w:sz="1"/>
+              <w:right w:val="single" w:color="E1E7EF" w:sz="1"/>
+            </w:tcBorders>
+            <w:tcMar>
+              <w:top w:type="dxa" w:w="60"/>
+              <w:left w:type="dxa" w:w="90"/>
+              <w:bottom w:type="dxa" w:w="60"/>
+              <w:right w:type="dxa" w:w="90"/>
+            </w:tcMar>
+          </w:tcPr>
+          <w:p>
+            <w:r>
+              <w:rPr>
+                <w:color w:val="0B1524"/>
+                <w:sz w:val="17"/>
+                <w:szCs w:val="17"/>
+              </w:rPr>
+              <w:t xml:space="preserve">Mahmoud Abdulaziz</w:t>
+            </w:r>
+          </w:p>
+        </w:tc>
+        <w:tc>
+          <w:tcPr>
+            <w:tcW w:type="pct" w:w="7.734806629834254%"/>
+            <w:tcBorders>
+              <w:top w:val="single" w:color="E1E7EF" w:sz="1"/>
+              <w:left w:val="single" w:color="E1E7EF" w:sz="1"/>
+              <w:bottom w:val="single" w:color="E1E7EF" w:sz="1"/>
+              <w:right w:val="single" w:color="E1E7EF" w:sz="1"/>
+            </w:tcBorders>
+            <w:tcMar>
+              <w:top w:type="dxa" w:w="60"/>
+              <w:left w:type="dxa" w:w="90"/>
+              <w:bottom w:type="dxa" w:w="60"/>
+              <w:right w:type="dxa" w:w="90"/>
+            </w:tcMar>
+          </w:tcPr>
+          <w:p>
+            <w:r>
+              <w:rPr>
+                <w:color w:val="0B1524"/>
+                <w:sz w:val="17"/>
+                <w:szCs w:val="17"/>
+              </w:rPr>
+              <w:t xml:space="preserve">Planned</w:t>
+            </w:r>
+          </w:p>
+        </w:tc>
+        <w:tc>
+          <w:tcPr>
+            <w:tcW w:type="pct" w:w="27.624309392265197%"/>
+            <w:tcBorders>
+              <w:top w:val="single" w:color="E1E7EF" w:sz="1"/>
+              <w:left w:val="single" w:color="E1E7EF" w:sz="1"/>
+              <w:bottom w:val="single" w:color="E1E7EF" w:sz="1"/>
+              <w:right w:val="single" w:color="E1E7EF" w:sz="1"/>
+            </w:tcBorders>
+            <w:tcMar>
+              <w:top w:type="dxa" w:w="60"/>
+              <w:left w:type="dxa" w:w="90"/>
+              <w:bottom w:type="dxa" w:w="60"/>
+              <w:right w:type="dxa" w:w="90"/>
+            </w:tcMar>
+          </w:tcPr>
+          <w:p>
+            <w:r>
+              <w:rPr>
+                <w:color w:val="0B1524"/>
+                <w:sz w:val="17"/>
+                <w:szCs w:val="17"/>
+              </w:rPr>
+              <w:t xml:space="preserve">Risk tier Medium (score 3.5).</w:t>
+            </w:r>
+          </w:p>
+        </w:tc>
+      </w:tr>
+      <w:tr>
+        <w:tc>
+          <w:tcPr>
+            <w:tcW w:type="pct" w:w="4.972375690607735%"/>
+            <w:tcBorders>
+              <w:top w:val="single" w:color="E1E7EF" w:sz="1"/>
+              <w:left w:val="single" w:color="E1E7EF" w:sz="1"/>
+              <w:bottom w:val="single" w:color="E1E7EF" w:sz="1"/>
+              <w:right w:val="single" w:color="E1E7EF" w:sz="1"/>
+            </w:tcBorders>
+            <w:tcMar>
+              <w:top w:type="dxa" w:w="60"/>
+              <w:left w:type="dxa" w:w="90"/>
+              <w:bottom w:type="dxa" w:w="60"/>
+              <w:right w:type="dxa" w:w="90"/>
+            </w:tcMar>
+          </w:tcPr>
+          <w:p>
+            <w:r>
+              <w:rPr>
+                <w:color w:val="0B1524"/>
+                <w:sz w:val="17"/>
+                <w:szCs w:val="17"/>
+              </w:rPr>
+              <w:t xml:space="preserve">Q4</w:t>
+            </w:r>
+          </w:p>
+        </w:tc>
+        <w:tc>
+          <w:tcPr>
+            <w:tcW w:type="pct" w:w="22.099447513812155%"/>
+            <w:tcBorders>
+              <w:top w:val="single" w:color="E1E7EF" w:sz="1"/>
+              <w:left w:val="single" w:color="E1E7EF" w:sz="1"/>
+              <w:bottom w:val="single" w:color="E1E7EF" w:sz="1"/>
+              <w:right w:val="single" w:color="E1E7EF" w:sz="1"/>
+            </w:tcBorders>
+            <w:tcMar>
+              <w:top w:type="dxa" w:w="60"/>
+              <w:left w:type="dxa" w:w="90"/>
+              <w:bottom w:type="dxa" w:w="60"/>
+              <w:right w:type="dxa" w:w="90"/>
+            </w:tcMar>
+          </w:tcPr>
+          <w:p>
+            <w:r>
+              <w:rPr>
+                <w:color w:val="0B1524"/>
+                <w:sz w:val="17"/>
+                <w:szCs w:val="17"/>
+              </w:rPr>
+              <w:t xml:space="preserve">Core banking platform</w:t>
+            </w:r>
+          </w:p>
+        </w:tc>
+        <w:tc>
+          <w:tcPr>
+            <w:tcW w:type="pct" w:w="7.734806629834254%"/>
+            <w:tcBorders>
+              <w:top w:val="single" w:color="E1E7EF" w:sz="1"/>
+              <w:left w:val="single" w:color="E1E7EF" w:sz="1"/>
+              <w:bottom w:val="single" w:color="E1E7EF" w:sz="1"/>
+              <w:right w:val="single" w:color="E1E7EF" w:sz="1"/>
+            </w:tcBorders>
+            <w:tcMar>
+              <w:top w:type="dxa" w:w="60"/>
+              <w:left w:type="dxa" w:w="90"/>
+              <w:bottom w:type="dxa" w:w="60"/>
+              <w:right w:type="dxa" w:w="90"/>
+            </w:tcMar>
+          </w:tcPr>
+          <w:p>
+            <w:r>
+              <w:rPr>
+                <w:color w:val="0B1524"/>
+                <w:sz w:val="17"/>
+                <w:szCs w:val="17"/>
+              </w:rPr>
+              <w:t xml:space="preserve">System</w:t>
+            </w:r>
+          </w:p>
+        </w:tc>
+        <w:tc>
+          <w:tcPr>
+            <w:tcW w:type="pct" w:w="6.077348066298343%"/>
+            <w:tcBorders>
+              <w:top w:val="single" w:color="E1E7EF" w:sz="1"/>
+              <w:left w:val="single" w:color="E1E7EF" w:sz="1"/>
+              <w:bottom w:val="single" w:color="E1E7EF" w:sz="1"/>
+              <w:right w:val="single" w:color="E1E7EF" w:sz="1"/>
+            </w:tcBorders>
+            <w:tcMar>
+              <w:top w:type="dxa" w:w="60"/>
+              <w:left w:type="dxa" w:w="90"/>
+              <w:bottom w:type="dxa" w:w="60"/>
+              <w:right w:type="dxa" w:w="90"/>
+            </w:tcMar>
+          </w:tcPr>
+          <w:p>
+            <w:r>
+              <w:rPr>
+                <w:color w:val="0B1524"/>
+                <w:sz w:val="17"/>
+                <w:szCs w:val="17"/>
+              </w:rPr>
+              <w:t xml:space="preserve">4.3</w:t>
+            </w:r>
+          </w:p>
+        </w:tc>
+        <w:tc>
+          <w:tcPr>
+            <w:tcW w:type="pct" w:w="5.524861878453039%"/>
+            <w:tcBorders>
+              <w:top w:val="single" w:color="E1E7EF" w:sz="1"/>
+              <w:left w:val="single" w:color="E1E7EF" w:sz="1"/>
+              <w:bottom w:val="single" w:color="E1E7EF" w:sz="1"/>
+              <w:right w:val="single" w:color="E1E7EF" w:sz="1"/>
+            </w:tcBorders>
+            <w:tcMar>
+              <w:top w:type="dxa" w:w="60"/>
+              <w:left w:type="dxa" w:w="90"/>
+              <w:bottom w:type="dxa" w:w="60"/>
+              <w:right w:type="dxa" w:w="90"/>
+            </w:tcMar>
+          </w:tcPr>
+          <w:p>
+            <w:r>
+              <w:rPr>
+                <w:color w:val="0B1524"/>
+                <w:sz w:val="17"/>
+                <w:szCs w:val="17"/>
+              </w:rPr>
+              <w:t xml:space="preserve">High</w:t>
+            </w:r>
+          </w:p>
+        </w:tc>
+        <w:tc>
+          <w:tcPr>
+            <w:tcW w:type="pct" w:w="7.18232044198895%"/>
+            <w:tcBorders>
+              <w:top w:val="single" w:color="E1E7EF" w:sz="1"/>
+              <w:left w:val="single" w:color="E1E7EF" w:sz="1"/>
+              <w:bottom w:val="single" w:color="E1E7EF" w:sz="1"/>
+              <w:right w:val="single" w:color="E1E7EF" w:sz="1"/>
+            </w:tcBorders>
+            <w:tcMar>
+              <w:top w:type="dxa" w:w="60"/>
+              <w:left w:type="dxa" w:w="90"/>
+              <w:bottom w:type="dxa" w:w="60"/>
+              <w:right w:type="dxa" w:w="90"/>
+            </w:tcMar>
+          </w:tcPr>
+          <w:p>
+            <w:r>
+              <w:rPr>
+                <w:color w:val="0B1524"/>
+                <w:sz w:val="17"/>
+                <w:szCs w:val="17"/>
+              </w:rPr>
+              <w:t xml:space="preserve">160</w:t>
+            </w:r>
+          </w:p>
+        </w:tc>
+        <w:tc>
+          <w:tcPr>
+            <w:tcW w:type="pct" w:w="11.049723756906078%"/>
+            <w:tcBorders>
+              <w:top w:val="single" w:color="E1E7EF" w:sz="1"/>
+              <w:left w:val="single" w:color="E1E7EF" w:sz="1"/>
+              <w:bottom w:val="single" w:color="E1E7EF" w:sz="1"/>
+              <w:right w:val="single" w:color="E1E7EF" w:sz="1"/>
+            </w:tcBorders>
+            <w:tcMar>
+              <w:top w:type="dxa" w:w="60"/>
+              <w:left w:type="dxa" w:w="90"/>
+              <w:bottom w:type="dxa" w:w="60"/>
+              <w:right w:type="dxa" w:w="90"/>
+            </w:tcMar>
+          </w:tcPr>
+          <w:p>
+            <w:r>
+              <w:rPr>
+                <w:color w:val="0B1524"/>
+                <w:sz w:val="17"/>
+                <w:szCs w:val="17"/>
+              </w:rPr>
+              <w:t xml:space="preserve">Mahmoud Abdulaziz</w:t>
+            </w:r>
+          </w:p>
+        </w:tc>
+        <w:tc>
+          <w:tcPr>
+            <w:tcW w:type="pct" w:w="7.734806629834254%"/>
+            <w:tcBorders>
+              <w:top w:val="single" w:color="E1E7EF" w:sz="1"/>
+              <w:left w:val="single" w:color="E1E7EF" w:sz="1"/>
+              <w:bottom w:val="single" w:color="E1E7EF" w:sz="1"/>
+              <w:right w:val="single" w:color="E1E7EF" w:sz="1"/>
+            </w:tcBorders>
+            <w:tcMar>
+              <w:top w:type="dxa" w:w="60"/>
+              <w:left w:type="dxa" w:w="90"/>
+              <w:bottom w:type="dxa" w:w="60"/>
+              <w:right w:type="dxa" w:w="90"/>
+            </w:tcMar>
+          </w:tcPr>
+          <w:p>
+            <w:r>
+              <w:rPr>
+                <w:color w:val="0B1524"/>
+                <w:sz w:val="17"/>
+                <w:szCs w:val="17"/>
+              </w:rPr>
+              <w:t xml:space="preserve">Planned</w:t>
+            </w:r>
+          </w:p>
+        </w:tc>
+        <w:tc>
+          <w:tcPr>
+            <w:tcW w:type="pct" w:w="27.624309392265197%"/>
+            <w:tcBorders>
+              <w:top w:val="single" w:color="E1E7EF" w:sz="1"/>
+              <w:left w:val="single" w:color="E1E7EF" w:sz="1"/>
+              <w:bottom w:val="single" w:color="E1E7EF" w:sz="1"/>
+              <w:right w:val="single" w:color="E1E7EF" w:sz="1"/>
+            </w:tcBorders>
+            <w:tcMar>
+              <w:top w:type="dxa" w:w="60"/>
+              <w:left w:type="dxa" w:w="90"/>
+              <w:bottom w:type="dxa" w:w="60"/>
+              <w:right w:type="dxa" w:w="90"/>
+            </w:tcMar>
+          </w:tcPr>
+          <w:p>
+            <w:r>
+              <w:rPr>
+                <w:color w:val="0B1524"/>
+                <w:sz w:val="17"/>
+                <w:szCs w:val="17"/>
+              </w:rPr>
+              <w:t xml:space="preserve">Risk tier High (score 4.3).</w:t>
             </w:r>
           </w:p>
         </w:tc>
@@ -899,7 +2859,7 @@
           <w:sz w:val="15"/>
           <w:szCs w:val="15"/>
         </w:rPr>
-        <w:t xml:space="preserve">Annual Audit Plan · OmniOps · generated 2026-08-16</w:t>
+        <w:t xml:space="preserve">Annual Audit Plan · OmniOps · generated 2026-08-17</w:t>
       </w:r>
     </w:p>
     <w:sectPr>

</xml_diff>